<commit_message>
Actualizar estructura a 9 módulos y actualizar guía
</commit_message>
<xml_diff>
--- a/Guia_Vilcacoto.docx
+++ b/Guia_Vilcacoto.docx
@@ -75,55 +75,115 @@
         <w:pStyle w:val="Heading2"/>
       </w:pPr>
       <w:r>
-        <w:t xml:space="preserve">Módulos Principales</w:t>
-      </w:r>
-    </w:p>
-    <w:p>
-      <w:r>
-        <w:rPr>
-          <w:b/>
-          <w:bCs/>
-        </w:rPr>
-        <w:t xml:space="preserve">- Recepción y Pesaje: </w:t>
-      </w:r>
-      <w:r>
-        <w:t xml:space="preserve">Permite registrar vehículos y automatizar el cálculo del peso neto usando el peso bruto y la tara (con validación de máximos).</w:t>
-      </w:r>
-    </w:p>
-    <w:p>
-      <w:r>
-        <w:rPr>
-          <w:b/>
-          <w:bCs/>
-        </w:rPr>
-        <w:t xml:space="preserve">- Segregación: </w:t>
-      </w:r>
-      <w:r>
-        <w:t xml:space="preserve">Permite cuantificar los materiales reciclables (Plásticos, Papel, Vidrio) y orgánicos.</w:t>
-      </w:r>
-    </w:p>
-    <w:p>
-      <w:r>
-        <w:rPr>
-          <w:b/>
-          <w:bCs/>
-        </w:rPr>
-        <w:t xml:space="preserve">- Tratamiento (Compostaje): </w:t>
-      </w:r>
-      <w:r>
-        <w:t xml:space="preserve">Bitácora digital para registrar temperatura y humedad de las pilas de compost.</w:t>
-      </w:r>
-    </w:p>
-    <w:p>
-      <w:r>
-        <w:rPr>
-          <w:b/>
-          <w:bCs/>
-        </w:rPr>
-        <w:t xml:space="preserve">- Control Ambiental: </w:t>
-      </w:r>
-      <w:r>
-        <w:t xml:space="preserve">Monitoreo del pH, DBO y DQO de los lixiviados con alertas.</w:t>
+        <w:t xml:space="preserve">Módulos Operativos (9 Pasos)</w:t>
+      </w:r>
+    </w:p>
+    <w:p>
+      <w:r>
+        <w:rPr>
+          <w:b/>
+          <w:bCs/>
+        </w:rPr>
+        <w:t xml:space="preserve">1. Recepción y Pesaje: </w:t>
+      </w:r>
+      <w:r>
+        <w:t xml:space="preserve">Registro de vehículos y automatización del peso neto (Peso Bruto - Tara).</w:t>
+      </w:r>
+    </w:p>
+    <w:p>
+      <w:r>
+        <w:rPr>
+          <w:b/>
+          <w:bCs/>
+        </w:rPr>
+        <w:t xml:space="preserve">2. Descarga y Almacenamiento Temporal: </w:t>
+      </w:r>
+      <w:r>
+        <w:t xml:space="preserve">Recepción en bahías para inspección previa a la separación.</w:t>
+      </w:r>
+    </w:p>
+    <w:p>
+      <w:r>
+        <w:rPr>
+          <w:b/>
+          <w:bCs/>
+        </w:rPr>
+        <w:t xml:space="preserve">3. Segregación o Clasificación: </w:t>
+      </w:r>
+      <w:r>
+        <w:t xml:space="preserve">Cuantificación de Papel, Cartón, Plásticos, Vidrio, Metales, Textiles y Orgánicos.</w:t>
+      </w:r>
+    </w:p>
+    <w:p>
+      <w:r>
+        <w:rPr>
+          <w:b/>
+          <w:bCs/>
+        </w:rPr>
+        <w:t xml:space="preserve">4. Trituración: </w:t>
+      </w:r>
+      <w:r>
+        <w:t xml:space="preserve">Reducción de tamaño de plásticos o metales mediante máquinas, con registro por lotes.</w:t>
+      </w:r>
+    </w:p>
+    <w:p>
+      <w:r>
+        <w:rPr>
+          <w:b/>
+          <w:bCs/>
+        </w:rPr>
+        <w:t xml:space="preserve">5. Tratamiento de Residuos Orgánicos: </w:t>
+      </w:r>
+      <w:r>
+        <w:t xml:space="preserve">Bitácora de temperatura/humedad para Compostaje y Biodigestión (Biogás).</w:t>
+      </w:r>
+    </w:p>
+    <w:p>
+      <w:r>
+        <w:rPr>
+          <w:b/>
+          <w:bCs/>
+        </w:rPr>
+        <w:t xml:space="preserve">6. Compactación: </w:t>
+      </w:r>
+      <w:r>
+        <w:t xml:space="preserve">Compresión de residuos no aprovechables registrando volumen final en m3.</w:t>
+      </w:r>
+    </w:p>
+    <w:p>
+      <w:r>
+        <w:rPr>
+          <w:b/>
+          <w:bCs/>
+        </w:rPr>
+        <w:t xml:space="preserve">7. Almacenamiento de Reciclables: </w:t>
+      </w:r>
+      <w:r>
+        <w:t xml:space="preserve">Inventario de materiales listos para comercialización.</w:t>
+      </w:r>
+    </w:p>
+    <w:p>
+      <w:r>
+        <w:rPr>
+          <w:b/>
+          <w:bCs/>
+        </w:rPr>
+        <w:t xml:space="preserve">8. Tratamiento de Lixiviados: </w:t>
+      </w:r>
+      <w:r>
+        <w:t xml:space="preserve">Monitoreo químico (pH, DBO, DQO) del líquido generado por la basura para evitar contaminación.</w:t>
+      </w:r>
+    </w:p>
+    <w:p>
+      <w:r>
+        <w:rPr>
+          <w:b/>
+          <w:bCs/>
+        </w:rPr>
+        <w:t xml:space="preserve">9. Disposición Final: </w:t>
+      </w:r>
+      <w:r>
+        <w:t xml:space="preserve">Envío y registro de los rechazos compactados al relleno sanitario autorizado.</w:t>
       </w:r>
     </w:p>
     <w:p/>

</xml_diff>